<commit_message>
Arquitectura Lambda: diagrama de sincronización batch-streaming
- docs/diagrama_lambda: capa batch, capa de velocidad y capa de servicio
  con 4 puntos de sincronización (sink a bronze, perfiles al streaming,
  vistas unificadas, reconciliación donde manda el batch)
- Diagrama de producción en 4 capas: BigQuery curated vs rt y vistas
  lumina_olap en Exposición
- Corrección: el plan decía "tipo Kappa"; lo implementado es Lambda
- Sustentación Entrega 1 (qmd + docx): nueva sección 2.1 Patrón Lambda
- AVANCE.md: estado de cada punto de sincronización

Co-Authored-By: Claude Opus 5.5 <noreply@anthropic.com>
</commit_message>
<xml_diff>
--- a/docs/entrega1/sustentacion_entrega1.docx
+++ b/docs/entrega1/sustentacion_entrega1.docx
@@ -398,7 +398,7 @@
       </w:tr>
     </w:tbl>
     <w:bookmarkEnd w:id="20"/>
-    <w:bookmarkStart w:id="25" w:name="arquitectura-end-to-end"/>
+    <w:bookmarkStart w:id="29" w:name="arquitectura-end-to-end"/>
     <w:p>
       <w:pPr>
         <w:pStyle w:val="Heading1"/>
@@ -414,7 +414,7 @@
       <w:r>
         <w:drawing>
           <wp:inline>
-            <wp:extent cx="5334000" cy="3031574"/>
+            <wp:extent cx="5334000" cy="2067593"/>
             <wp:effectExtent b="0" l="0" r="0" t="0"/>
             <wp:docPr descr="Arquitectura de producción en cuatro capas" title="" id="22" name="Picture"/>
             <a:graphic>
@@ -435,7 +435,7 @@
                   <pic:spPr bwMode="auto">
                     <a:xfrm>
                       <a:off x="0" y="0"/>
-                      <a:ext cx="5334000" cy="3031574"/>
+                      <a:ext cx="5334000" cy="2067593"/>
                     </a:xfrm>
                     <a:prstGeom prst="rect">
                       <a:avLst/>
@@ -613,18 +613,48 @@
               <w:pStyle w:val="Compact"/>
             </w:pPr>
             <w:r>
-              <w:t xml:space="preserve">Lakehouse en GCS (raw, silver, gold en Parquet); BigQuery; Bigtable</w:t>
-            </w:r>
-          </w:p>
-        </w:tc>
-        <w:tc>
-          <w:tcPr/>
-          <w:p>
-            <w:pPr>
-              <w:pStyle w:val="Compact"/>
-            </w:pPr>
-            <w:r>
-              <w:t xml:space="preserve">Fuente de verdad barata y abierta; warehouse analítico; serie de tiempo por medidor para la app</w:t>
+              <w:t xml:space="preserve">Lakehouse en GCS (raw, silver, gold en Parquet); BigQuery</w:t>
+            </w:r>
+            <w:r>
+              <w:t xml:space="preserve"> </w:t>
+            </w:r>
+            <w:r>
+              <w:rPr>
+                <w:rStyle w:val="VerbatimChar"/>
+              </w:rPr>
+              <w:t xml:space="preserve">curated</w:t>
+            </w:r>
+            <w:r>
+              <w:t xml:space="preserve"> </w:t>
+            </w:r>
+            <w:r>
+              <w:t xml:space="preserve">(capa batch) y</w:t>
+            </w:r>
+            <w:r>
+              <w:t xml:space="preserve"> </w:t>
+            </w:r>
+            <w:r>
+              <w:rPr>
+                <w:rStyle w:val="VerbatimChar"/>
+              </w:rPr>
+              <w:t xml:space="preserve">rt</w:t>
+            </w:r>
+            <w:r>
+              <w:t xml:space="preserve"> </w:t>
+            </w:r>
+            <w:r>
+              <w:t xml:space="preserve">(capa de velocidad); Bigtable</w:t>
+            </w:r>
+          </w:p>
+        </w:tc>
+        <w:tc>
+          <w:tcPr/>
+          <w:p>
+            <w:pPr>
+              <w:pStyle w:val="Compact"/>
+            </w:pPr>
+            <w:r>
+              <w:t xml:space="preserve">Fuente de verdad barata y abierta; warehouse analítico histórico y de lo reciente; serie de tiempo por medidor para la app</w:t>
             </w:r>
           </w:p>
         </w:tc>
@@ -652,7 +682,22 @@
               <w:pStyle w:val="Compact"/>
             </w:pPr>
             <w:r>
-              <w:t xml:space="preserve">API REST/WebSocket en Cloud Run; Looker Studio; tópico</w:t>
+              <w:t xml:space="preserve">Vistas</w:t>
+            </w:r>
+            <w:r>
+              <w:t xml:space="preserve"> </w:t>
+            </w:r>
+            <w:r>
+              <w:rPr>
+                <w:rStyle w:val="VerbatimChar"/>
+              </w:rPr>
+              <w:t xml:space="preserve">lumina_olap</w:t>
+            </w:r>
+            <w:r>
+              <w:t xml:space="preserve"> </w:t>
+            </w:r>
+            <w:r>
+              <w:t xml:space="preserve">(unen historia y hoy); API REST/WebSocket en Cloud Run; Looker Studio; tópico</w:t>
             </w:r>
             <w:r>
               <w:t xml:space="preserve"> </w:t>
@@ -672,7 +717,7 @@
               <w:pStyle w:val="Compact"/>
             </w:pPr>
             <w:r>
-              <w:t xml:space="preserve">Consumo en vivo para la app, informes OLAP y señales de respuesta a la demanda</w:t>
+              <w:t xml:space="preserve">Una sola vista de los datos para la app, los informes OLAP y las señales de respuesta a la demanda</w:t>
             </w:r>
           </w:p>
         </w:tc>
@@ -713,13 +758,13 @@
         </w:tc>
       </w:tr>
     </w:tbl>
-    <w:bookmarkStart w:id="24" w:name="X8f9251a81d749753af419a6c9c278c55a66fbdd"/>
+    <w:bookmarkStart w:id="27" w:name="X4443dd0ec4c01ffed4c05da6fb54d7eae3b635e"/>
     <w:p>
       <w:pPr>
         <w:pStyle w:val="Heading2"/>
       </w:pPr>
       <w:r>
-        <w:t xml:space="preserve">2.1 Producción frente al prototipo del taller</w:t>
+        <w:t xml:space="preserve">2.1 Patrón Lambda: cómo se combinan batch y streaming</w:t>
       </w:r>
     </w:p>
     <w:p>
@@ -727,7 +772,139 @@
         <w:pStyle w:val="FirstParagraph"/>
       </w:pPr>
       <w:r>
-        <w:t xml:space="preserve">El prototipo usa los mismos motores y formatos con menos capacidad, para mantenerse dentro de US$300:</w:t>
+        <w:t xml:space="preserve">La arquitectura sigue el patrón</w:t>
+      </w:r>
+      <w:r>
+        <w:t xml:space="preserve"> </w:t>
+      </w:r>
+      <w:r>
+        <w:rPr>
+          <w:b/>
+          <w:bCs/>
+        </w:rPr>
+        <w:t xml:space="preserve">Lambda</w:t>
+      </w:r>
+      <w:r>
+        <w:t xml:space="preserve">: una</w:t>
+      </w:r>
+      <w:r>
+        <w:t xml:space="preserve"> </w:t>
+      </w:r>
+      <w:r>
+        <w:rPr>
+          <w:b/>
+          <w:bCs/>
+        </w:rPr>
+        <w:t xml:space="preserve">capa batch</w:t>
+      </w:r>
+      <w:r>
+        <w:t xml:space="preserve"> </w:t>
+      </w:r>
+      <w:r>
+        <w:t xml:space="preserve">que guarda la verdad histórica y aprende qué es normal para cada hogar, una</w:t>
+      </w:r>
+      <w:r>
+        <w:t xml:space="preserve"> </w:t>
+      </w:r>
+      <w:r>
+        <w:rPr>
+          <w:b/>
+          <w:bCs/>
+        </w:rPr>
+        <w:t xml:space="preserve">capa de velocidad</w:t>
+      </w:r>
+      <w:r>
+        <w:t xml:space="preserve"> </w:t>
+      </w:r>
+      <w:r>
+        <w:t xml:space="preserve">que evalúa cada lectura nueva en segundos, y una</w:t>
+      </w:r>
+      <w:r>
+        <w:t xml:space="preserve"> </w:t>
+      </w:r>
+      <w:r>
+        <w:rPr>
+          <w:b/>
+          <w:bCs/>
+        </w:rPr>
+        <w:t xml:space="preserve">capa de servicio</w:t>
+      </w:r>
+      <w:r>
+        <w:t xml:space="preserve"> </w:t>
+      </w:r>
+      <w:r>
+        <w:t xml:space="preserve">que las une. Se descartó</w:t>
+      </w:r>
+      <w:r>
+        <w:t xml:space="preserve"> </w:t>
+      </w:r>
+      <w:r>
+        <w:rPr>
+          <w:b/>
+          <w:bCs/>
+        </w:rPr>
+        <w:t xml:space="preserve">Kappa</w:t>
+      </w:r>
+      <w:r>
+        <w:t xml:space="preserve"> </w:t>
+      </w:r>
+      <w:r>
+        <w:t xml:space="preserve">(solo streaming, reprocesando la historia desde el log de Kafka), porque los perfiles por hogar, el pronóstico D+1 y los informes requieren recalcular dos años de historia, y eso es más barato y simple en batch. Para no duplicar lógica, ambas capas usan el mismo motor (Spark) y una sola puerta de entrada (Kafka).</w:t>
+      </w:r>
+    </w:p>
+    <w:p>
+      <w:pPr>
+        <w:pStyle w:val="CaptionedFigure"/>
+      </w:pPr>
+      <w:r>
+        <w:drawing>
+          <wp:inline>
+            <wp:extent cx="5334000" cy="765753"/>
+            <wp:effectExtent b="0" l="0" r="0" t="0"/>
+            <wp:docPr descr="Arquitectura Lambda y puntos de sincronización" title="" id="25" name="Picture"/>
+            <a:graphic>
+              <a:graphicData uri="http://schemas.openxmlformats.org/drawingml/2006/picture">
+                <pic:pic>
+                  <pic:nvPicPr>
+                    <pic:cNvPr descr="../diagrama_lambda.png" id="26" name="Picture"/>
+                    <pic:cNvPicPr>
+                      <a:picLocks noChangeArrowheads="1" noChangeAspect="1"/>
+                    </pic:cNvPicPr>
+                  </pic:nvPicPr>
+                  <pic:blipFill>
+                    <a:blip r:embed="rId24"/>
+                    <a:stretch>
+                      <a:fillRect/>
+                    </a:stretch>
+                  </pic:blipFill>
+                  <pic:spPr bwMode="auto">
+                    <a:xfrm>
+                      <a:off x="0" y="0"/>
+                      <a:ext cx="5334000" cy="765753"/>
+                    </a:xfrm>
+                    <a:prstGeom prst="rect">
+                      <a:avLst/>
+                    </a:prstGeom>
+                    <a:noFill/>
+                    <a:ln w="9525">
+                      <a:noFill/>
+                      <a:headEnd/>
+                      <a:tailEnd/>
+                    </a:ln>
+                  </pic:spPr>
+                </pic:pic>
+              </a:graphicData>
+            </a:graphic>
+          </wp:inline>
+        </w:drawing>
+      </w:r>
+    </w:p>
+    <w:p>
+      <w:pPr>
+        <w:pStyle w:val="ImageCaption"/>
+      </w:pPr>
+      <w:r>
+        <w:t xml:space="preserve">Arquitectura Lambda y puntos de sincronización</w:t>
       </w:r>
     </w:p>
     <w:tbl>
@@ -753,6 +930,299 @@
               <w:pStyle w:val="Compact"/>
             </w:pPr>
             <w:r>
+              <w:t xml:space="preserve">#</w:t>
+            </w:r>
+          </w:p>
+        </w:tc>
+        <w:tc>
+          <w:tcPr/>
+          <w:p>
+            <w:pPr>
+              <w:pStyle w:val="Compact"/>
+            </w:pPr>
+            <w:r>
+              <w:t xml:space="preserve">Sincronización</w:t>
+            </w:r>
+          </w:p>
+        </w:tc>
+        <w:tc>
+          <w:tcPr/>
+          <w:p>
+            <w:pPr>
+              <w:pStyle w:val="Compact"/>
+            </w:pPr>
+            <w:r>
+              <w:t xml:space="preserve">Mecanismo</w:t>
+            </w:r>
+          </w:p>
+        </w:tc>
+      </w:tr>
+      <w:tr>
+        <w:tc>
+          <w:tcPr/>
+          <w:p>
+            <w:pPr>
+              <w:pStyle w:val="Compact"/>
+            </w:pPr>
+            <w:r>
+              <w:t xml:space="preserve">1</w:t>
+            </w:r>
+          </w:p>
+        </w:tc>
+        <w:tc>
+          <w:tcPr/>
+          <w:p>
+            <w:pPr>
+              <w:pStyle w:val="Compact"/>
+            </w:pPr>
+            <w:r>
+              <w:t xml:space="preserve">La lectura en vivo pasa a la historia</w:t>
+            </w:r>
+          </w:p>
+        </w:tc>
+        <w:tc>
+          <w:tcPr/>
+          <w:p>
+            <w:pPr>
+              <w:pStyle w:val="Compact"/>
+            </w:pPr>
+            <w:r>
+              <w:t xml:space="preserve">Kafka Connect copia cada evento a bronze; el batch nocturno la procesa</w:t>
+            </w:r>
+          </w:p>
+        </w:tc>
+      </w:tr>
+      <w:tr>
+        <w:tc>
+          <w:tcPr/>
+          <w:p>
+            <w:pPr>
+              <w:pStyle w:val="Compact"/>
+            </w:pPr>
+            <w:r>
+              <w:t xml:space="preserve">2</w:t>
+            </w:r>
+          </w:p>
+        </w:tc>
+        <w:tc>
+          <w:tcPr/>
+          <w:p>
+            <w:pPr>
+              <w:pStyle w:val="Compact"/>
+            </w:pPr>
+            <w:r>
+              <w:t xml:space="preserve">Lo aprendido llega al streaming</w:t>
+            </w:r>
+          </w:p>
+        </w:tc>
+        <w:tc>
+          <w:tcPr/>
+          <w:p>
+            <w:pPr>
+              <w:pStyle w:val="Compact"/>
+            </w:pPr>
+            <w:r>
+              <w:rPr>
+                <w:rStyle w:val="VerbatimChar"/>
+              </w:rPr>
+              <w:t xml:space="preserve">perfil_hogar</w:t>
+            </w:r>
+            <w:r>
+              <w:t xml:space="preserve"> </w:t>
+            </w:r>
+            <w:r>
+              <w:t xml:space="preserve">y</w:t>
+            </w:r>
+            <w:r>
+              <w:t xml:space="preserve"> </w:t>
+            </w:r>
+            <w:r>
+              <w:rPr>
+                <w:rStyle w:val="VerbatimChar"/>
+              </w:rPr>
+              <w:t xml:space="preserve">umbral_zona</w:t>
+            </w:r>
+            <w:r>
+              <w:t xml:space="preserve"> </w:t>
+            </w:r>
+            <w:r>
+              <w:t xml:space="preserve">(batch) son los umbrales del streaming; se recargan cada día</w:t>
+            </w:r>
+          </w:p>
+        </w:tc>
+      </w:tr>
+      <w:tr>
+        <w:tc>
+          <w:tcPr/>
+          <w:p>
+            <w:pPr>
+              <w:pStyle w:val="Compact"/>
+            </w:pPr>
+            <w:r>
+              <w:t xml:space="preserve">3</w:t>
+            </w:r>
+          </w:p>
+        </w:tc>
+        <w:tc>
+          <w:tcPr/>
+          <w:p>
+            <w:pPr>
+              <w:pStyle w:val="Compact"/>
+            </w:pPr>
+            <w:r>
+              <w:t xml:space="preserve">Una sola vista para el consumo</w:t>
+            </w:r>
+          </w:p>
+        </w:tc>
+        <w:tc>
+          <w:tcPr/>
+          <w:p>
+            <w:pPr>
+              <w:pStyle w:val="Compact"/>
+            </w:pPr>
+            <w:r>
+              <w:t xml:space="preserve">Las vistas</w:t>
+            </w:r>
+            <w:r>
+              <w:t xml:space="preserve"> </w:t>
+            </w:r>
+            <w:r>
+              <w:rPr>
+                <w:rStyle w:val="VerbatimChar"/>
+              </w:rPr>
+              <w:t xml:space="preserve">lumina_olap</w:t>
+            </w:r>
+            <w:r>
+              <w:t xml:space="preserve"> </w:t>
+            </w:r>
+            <w:r>
+              <w:t xml:space="preserve">unen</w:t>
+            </w:r>
+            <w:r>
+              <w:t xml:space="preserve"> </w:t>
+            </w:r>
+            <w:r>
+              <w:rPr>
+                <w:rStyle w:val="VerbatimChar"/>
+              </w:rPr>
+              <w:t xml:space="preserve">curated</w:t>
+            </w:r>
+            <w:r>
+              <w:t xml:space="preserve"> </w:t>
+            </w:r>
+            <w:r>
+              <w:t xml:space="preserve">(hasta ayer) con</w:t>
+            </w:r>
+            <w:r>
+              <w:t xml:space="preserve"> </w:t>
+            </w:r>
+            <w:r>
+              <w:rPr>
+                <w:rStyle w:val="VerbatimChar"/>
+              </w:rPr>
+              <w:t xml:space="preserve">rt</w:t>
+            </w:r>
+            <w:r>
+              <w:t xml:space="preserve"> </w:t>
+            </w:r>
+            <w:r>
+              <w:t xml:space="preserve">(hoy)</w:t>
+            </w:r>
+          </w:p>
+        </w:tc>
+      </w:tr>
+      <w:tr>
+        <w:tc>
+          <w:tcPr/>
+          <w:p>
+            <w:pPr>
+              <w:pStyle w:val="Compact"/>
+            </w:pPr>
+            <w:r>
+              <w:t xml:space="preserve">4</w:t>
+            </w:r>
+          </w:p>
+        </w:tc>
+        <w:tc>
+          <w:tcPr/>
+          <w:p>
+            <w:pPr>
+              <w:pStyle w:val="Compact"/>
+            </w:pPr>
+            <w:r>
+              <w:t xml:space="preserve">El dato provisional se vuelve definitivo</w:t>
+            </w:r>
+          </w:p>
+        </w:tc>
+        <w:tc>
+          <w:tcPr/>
+          <w:p>
+            <w:pPr>
+              <w:pStyle w:val="Compact"/>
+            </w:pPr>
+            <w:r>
+              <w:t xml:space="preserve">De</w:t>
+            </w:r>
+            <w:r>
+              <w:t xml:space="preserve"> </w:t>
+            </w:r>
+            <w:r>
+              <w:rPr>
+                <w:rStyle w:val="VerbatimChar"/>
+              </w:rPr>
+              <w:t xml:space="preserve">rt</w:t>
+            </w:r>
+            <w:r>
+              <w:t xml:space="preserve"> </w:t>
+            </w:r>
+            <w:r>
+              <w:t xml:space="preserve">solo se toma lo posterior al último batch; si hay diferencia, manda el batch, que incorpora lecturas atrasadas</w:t>
+            </w:r>
+          </w:p>
+        </w:tc>
+      </w:tr>
+    </w:tbl>
+    <w:bookmarkEnd w:id="27"/>
+    <w:bookmarkStart w:id="28" w:name="X8f9251a81d749753af419a6c9c278c55a66fbdd"/>
+    <w:p>
+      <w:pPr>
+        <w:pStyle w:val="Heading2"/>
+      </w:pPr>
+      <w:r>
+        <w:t xml:space="preserve">2.2 Producción frente al prototipo del taller</w:t>
+      </w:r>
+    </w:p>
+    <w:p>
+      <w:pPr>
+        <w:pStyle w:val="FirstParagraph"/>
+      </w:pPr>
+      <w:r>
+        <w:t xml:space="preserve">El prototipo usa los mismos motores y formatos con menos capacidad, para mantenerse dentro de US$300:</w:t>
+      </w:r>
+    </w:p>
+    <w:tbl>
+      <w:tblPr>
+        <w:tblStyle w:val="Table"/>
+        <w:tblW w:type="pct" w:w="5000"/>
+        <w:tblLayout w:type="fixed"/>
+        <w:tblLook w:firstRow="1" w:lastRow="0" w:firstColumn="0" w:lastColumn="0" w:noHBand="0" w:noVBand="0" w:val="0020"/>
+      </w:tblPr>
+      <w:tblGrid>
+        <w:gridCol w:w="2640"/>
+        <w:gridCol w:w="2640"/>
+        <w:gridCol w:w="2640"/>
+      </w:tblGrid>
+      <w:tr>
+        <w:trPr>
+          <w:tblHeader w:val="on"/>
+        </w:trPr>
+        <w:tc>
+          <w:tcPr/>
+          <w:p>
+            <w:pPr>
+              <w:pStyle w:val="Compact"/>
+            </w:pPr>
+            <w:r>
               <w:t xml:space="preserve">Pieza</w:t>
             </w:r>
           </w:p>
@@ -1017,9 +1487,9 @@
         </w:tc>
       </w:tr>
     </w:tbl>
-    <w:bookmarkEnd w:id="24"/>
-    <w:bookmarkEnd w:id="25"/>
-    <w:bookmarkStart w:id="29" w:name="integración-multifuente"/>
+    <w:bookmarkEnd w:id="28"/>
+    <w:bookmarkEnd w:id="29"/>
+    <w:bookmarkStart w:id="33" w:name="integración-multifuente"/>
     <w:p>
       <w:pPr>
         <w:pStyle w:val="Heading1"/>
@@ -1028,7 +1498,7 @@
         <w:t xml:space="preserve">3. Integración multifuente</w:t>
       </w:r>
     </w:p>
-    <w:bookmarkStart w:id="26" w:name="fuentes-y-mecanismo-de-captura"/>
+    <w:bookmarkStart w:id="30" w:name="fuentes-y-mecanismo-de-captura"/>
     <w:p>
       <w:pPr>
         <w:pStyle w:val="Heading2"/>
@@ -1643,8 +2113,8 @@
         </w:tc>
       </w:tr>
     </w:tbl>
-    <w:bookmarkEnd w:id="26"/>
-    <w:bookmarkStart w:id="27" w:name="cómo-se-cruzan-los-datos"/>
+    <w:bookmarkEnd w:id="30"/>
+    <w:bookmarkStart w:id="31" w:name="cómo-se-cruzan-los-datos"/>
     <w:p>
       <w:pPr>
         <w:pStyle w:val="Heading2"/>
@@ -1850,8 +2320,8 @@
         <w:t xml:space="preserve">diagnostica a cada medidor.</w:t>
       </w:r>
     </w:p>
-    <w:bookmarkEnd w:id="27"/>
-    <w:bookmarkStart w:id="28" w:name="evidencia-del-prototipo"/>
+    <w:bookmarkEnd w:id="31"/>
+    <w:bookmarkStart w:id="32" w:name="evidencia-del-prototipo"/>
     <w:p>
       <w:pPr>
         <w:pStyle w:val="Heading2"/>
@@ -1900,9 +2370,9 @@
         <w:t xml:space="preserve">Diagnóstico de 5,561 medidores: 5,068 sin problemas, 240 con huecos frecuentes, 232 con más de 24 h seguidas en cero y 21 con cobertura menor al 90 %.</w:t>
       </w:r>
     </w:p>
-    <w:bookmarkEnd w:id="28"/>
-    <w:bookmarkEnd w:id="29"/>
-    <w:bookmarkStart w:id="32" w:name="definición-de-ingesta-y-almacenamiento"/>
+    <w:bookmarkEnd w:id="32"/>
+    <w:bookmarkEnd w:id="33"/>
+    <w:bookmarkStart w:id="36" w:name="definición-de-ingesta-y-almacenamiento"/>
     <w:p>
       <w:pPr>
         <w:pStyle w:val="Heading1"/>
@@ -1911,7 +2381,7 @@
         <w:t xml:space="preserve">4. Definición de ingesta y almacenamiento</w:t>
       </w:r>
     </w:p>
-    <w:bookmarkStart w:id="30" w:name="ingesta"/>
+    <w:bookmarkStart w:id="34" w:name="ingesta"/>
     <w:p>
       <w:pPr>
         <w:pStyle w:val="Heading2"/>
@@ -2166,8 +2636,8 @@
         </w:tc>
       </w:tr>
     </w:tbl>
-    <w:bookmarkEnd w:id="30"/>
-    <w:bookmarkStart w:id="31" w:name="almacenamiento-según-volumen-y-velocidad"/>
+    <w:bookmarkEnd w:id="34"/>
+    <w:bookmarkStart w:id="35" w:name="almacenamiento-según-volumen-y-velocidad"/>
     <w:p>
       <w:pPr>
         <w:pStyle w:val="Heading2"/>
@@ -2431,9 +2901,9 @@
         </w:tc>
       </w:tr>
     </w:tbl>
-    <w:bookmarkEnd w:id="31"/>
-    <w:bookmarkEnd w:id="32"/>
-    <w:bookmarkStart w:id="33" w:name="justificación-del-stack-tecnológico"/>
+    <w:bookmarkEnd w:id="35"/>
+    <w:bookmarkEnd w:id="36"/>
+    <w:bookmarkStart w:id="37" w:name="justificación-del-stack-tecnológico"/>
     <w:p>
       <w:pPr>
         <w:pStyle w:val="Heading1"/>
@@ -2912,8 +3382,8 @@
         </w:tc>
       </w:tr>
     </w:tbl>
-    <w:bookmarkEnd w:id="33"/>
-    <w:bookmarkStart w:id="37" w:name="escalabilidad-y-performance"/>
+    <w:bookmarkEnd w:id="37"/>
+    <w:bookmarkStart w:id="41" w:name="escalabilidad-y-performance"/>
     <w:p>
       <w:pPr>
         <w:pStyle w:val="Heading1"/>
@@ -2922,7 +3392,7 @@
         <w:t xml:space="preserve">6. Escalabilidad y performance</w:t>
       </w:r>
     </w:p>
-    <w:bookmarkStart w:id="34" w:name="modelo-de-carga"/>
+    <w:bookmarkStart w:id="38" w:name="modelo-de-carga"/>
     <w:p>
       <w:pPr>
         <w:pStyle w:val="Heading2"/>
@@ -3157,8 +3627,8 @@
         </w:tc>
       </w:tr>
     </w:tbl>
-    <w:bookmarkEnd w:id="34"/>
-    <w:bookmarkStart w:id="35" w:name="el-black-friday-de-una-red-eléctrica"/>
+    <w:bookmarkEnd w:id="38"/>
+    <w:bookmarkStart w:id="39" w:name="el-black-friday-de-una-red-eléctrica"/>
     <w:p>
       <w:pPr>
         <w:pStyle w:val="Heading2"/>
@@ -3301,8 +3771,8 @@
         <w:t xml:space="preserve">Tras un corte, los concentradores reenvían de golpe las horas acumuladas.</w:t>
       </w:r>
     </w:p>
-    <w:bookmarkEnd w:id="35"/>
-    <w:bookmarkStart w:id="36" w:name="cómo-escala-cada-capa"/>
+    <w:bookmarkEnd w:id="39"/>
+    <w:bookmarkStart w:id="40" w:name="cómo-escala-cada-capa"/>
     <w:p>
       <w:pPr>
         <w:pStyle w:val="Heading2"/>
@@ -3586,9 +4056,9 @@
         <w:t xml:space="preserve">en las tablas (particiones o datasets separados); el código no cambia.</w:t>
       </w:r>
     </w:p>
-    <w:bookmarkEnd w:id="36"/>
-    <w:bookmarkEnd w:id="37"/>
-    <w:bookmarkStart w:id="44" w:name="Xe588ac3521b1fb8b4cb5e84ace2a581ac766eef"/>
+    <w:bookmarkEnd w:id="40"/>
+    <w:bookmarkEnd w:id="41"/>
+    <w:bookmarkStart w:id="48" w:name="Xe588ac3521b1fb8b4cb5e84ace2a581ac766eef"/>
     <w:p>
       <w:pPr>
         <w:pStyle w:val="Heading1"/>
@@ -3597,7 +4067,7 @@
         <w:t xml:space="preserve">7. Justificación económica y optimización de costos</w:t>
       </w:r>
     </w:p>
-    <w:bookmarkStart w:id="40" w:name="X4b9e767322845a47294bc1db8f9c956c5e449e8"/>
+    <w:bookmarkStart w:id="44" w:name="X4b9e767322845a47294bc1db8f9c956c5e449e8"/>
     <w:p>
       <w:pPr>
         <w:pStyle w:val="Heading2"/>
@@ -3629,7 +4099,7 @@
         <w:t xml:space="preserve">regenera estas tablas al cambiar un supuesto.</w:t>
       </w:r>
     </w:p>
-    <w:bookmarkStart w:id="38" w:name="escenario-base-lectura-cada-30-min"/>
+    <w:bookmarkStart w:id="42" w:name="escenario-base-lectura-cada-30-min"/>
     <w:p>
       <w:pPr>
         <w:pStyle w:val="Heading3"/>
@@ -4368,8 +4838,8 @@
         </w:tc>
       </w:tr>
     </w:tbl>
-    <w:bookmarkEnd w:id="38"/>
-    <w:bookmarkStart w:id="39" w:name="Xa9c18dc3cc4972546d113df84305e90363da2e3"/>
+    <w:bookmarkEnd w:id="42"/>
+    <w:bookmarkStart w:id="43" w:name="Xa9c18dc3cc4972546d113df84305e90363da2e3"/>
     <w:p>
       <w:pPr>
         <w:pStyle w:val="Heading3"/>
@@ -5108,9 +5578,9 @@
         </w:tc>
       </w:tr>
     </w:tbl>
-    <w:bookmarkEnd w:id="39"/>
-    <w:bookmarkEnd w:id="40"/>
-    <w:bookmarkStart w:id="41" w:name="lectura-de-las-cifras"/>
+    <w:bookmarkEnd w:id="43"/>
+    <w:bookmarkEnd w:id="44"/>
+    <w:bookmarkStart w:id="45" w:name="lectura-de-las-cifras"/>
     <w:p>
       <w:pPr>
         <w:pStyle w:val="Heading2"/>
@@ -5182,8 +5652,8 @@
         <w:t xml:space="preserve">, por servir 9 M de usuarios con latencia de milisegundos; si la app tolera segundos, puede sustituirse por BigQuery con BI Engine y el total baja ~40 %.</w:t>
       </w:r>
     </w:p>
-    <w:bookmarkEnd w:id="41"/>
-    <w:bookmarkStart w:id="42" w:name="palancas-de-optimización-aplicadas"/>
+    <w:bookmarkEnd w:id="45"/>
+    <w:bookmarkStart w:id="46" w:name="palancas-de-optimización-aplicadas"/>
     <w:p>
       <w:pPr>
         <w:pStyle w:val="Heading2"/>
@@ -5399,8 +5869,8 @@
         </w:tc>
       </w:tr>
     </w:tbl>
-    <w:bookmarkEnd w:id="42"/>
-    <w:bookmarkStart w:id="43" w:name="valor-para-el-negocio"/>
+    <w:bookmarkEnd w:id="46"/>
+    <w:bookmarkStart w:id="47" w:name="valor-para-el-negocio"/>
     <w:p>
       <w:pPr>
         <w:pStyle w:val="Heading2"/>
@@ -5475,9 +5945,9 @@
         <w:t xml:space="preserve">Se reportará en Looker Studio como (costo de plataforma + compras de emergencia evitadas) / kWh distribuido, por zona y mes.</w:t>
       </w:r>
     </w:p>
-    <w:bookmarkEnd w:id="43"/>
-    <w:bookmarkEnd w:id="44"/>
-    <w:bookmarkStart w:id="48" w:name="Xd9a7a9e19942aaec592af67dda9c969670bacca"/>
+    <w:bookmarkEnd w:id="47"/>
+    <w:bookmarkEnd w:id="48"/>
+    <w:bookmarkStart w:id="52" w:name="Xd9a7a9e19942aaec592af67dda9c969670bacca"/>
     <w:p>
       <w:pPr>
         <w:pStyle w:val="Heading1"/>
@@ -5486,7 +5956,7 @@
         <w:t xml:space="preserve">8. Plan de recuperación y alta disponibilidad (DRP/HA)</w:t>
       </w:r>
     </w:p>
-    <w:bookmarkStart w:id="45" w:name="objetivos-por-nivel-de-servicio"/>
+    <w:bookmarkStart w:id="49" w:name="objetivos-por-nivel-de-servicio"/>
     <w:p>
       <w:pPr>
         <w:pStyle w:val="Heading2"/>
@@ -5686,8 +6156,8 @@
         </w:tc>
       </w:tr>
     </w:tbl>
-    <w:bookmarkEnd w:id="45"/>
-    <w:bookmarkStart w:id="46" w:name="componentes-fallas-y-mitigación"/>
+    <w:bookmarkEnd w:id="49"/>
+    <w:bookmarkStart w:id="50" w:name="componentes-fallas-y-mitigación"/>
     <w:p>
       <w:pPr>
         <w:pStyle w:val="Heading2"/>
@@ -6184,8 +6654,8 @@
         </w:tc>
       </w:tr>
     </w:tbl>
-    <w:bookmarkEnd w:id="46"/>
-    <w:bookmarkStart w:id="47" w:name="runbook-resumido-ante-caída-regional"/>
+    <w:bookmarkEnd w:id="50"/>
+    <w:bookmarkStart w:id="51" w:name="runbook-resumido-ante-caída-regional"/>
     <w:p>
       <w:pPr>
         <w:pStyle w:val="Heading2"/>
@@ -6283,9 +6753,9 @@
         <w:t xml:space="preserve">).</w:t>
       </w:r>
     </w:p>
-    <w:bookmarkEnd w:id="47"/>
-    <w:bookmarkEnd w:id="48"/>
-    <w:bookmarkStart w:id="49" w:name="seguridad-y-gobernanza"/>
+    <w:bookmarkEnd w:id="51"/>
+    <w:bookmarkEnd w:id="52"/>
+    <w:bookmarkStart w:id="53" w:name="seguridad-y-gobernanza"/>
     <w:p>
       <w:pPr>
         <w:pStyle w:val="Heading1"/>
@@ -6403,8 +6873,8 @@
         <w:t xml:space="preserve">Capas raw, silver y gold separadas; reglas de calidad versionadas; auditoría con Cloud Audit Logs.</w:t>
       </w:r>
     </w:p>
-    <w:bookmarkEnd w:id="49"/>
-    <w:bookmarkStart w:id="50" w:name="supuestos-y-fuera-de-alcance"/>
+    <w:bookmarkEnd w:id="53"/>
+    <w:bookmarkStart w:id="54" w:name="supuestos-y-fuera-de-alcance"/>
     <w:p>
       <w:pPr>
         <w:pStyle w:val="Heading1"/>
@@ -6464,8 +6934,8 @@
         <w:t xml:space="preserve">facturación real, integración con los sistemas de las 12 distribuidoras, control físico de termostatos y baterías, y el front-end (adjudicado en otra RFP).</w:t>
       </w:r>
     </w:p>
-    <w:bookmarkEnd w:id="50"/>
-    <w:bookmarkStart w:id="51" w:name="próximos-pasos"/>
+    <w:bookmarkEnd w:id="54"/>
+    <w:bookmarkStart w:id="55" w:name="próximos-pasos"/>
     <w:p>
       <w:pPr>
         <w:pStyle w:val="Heading1"/>
@@ -6595,8 +7065,8 @@
         </w:tc>
       </w:tr>
     </w:tbl>
-    <w:bookmarkEnd w:id="51"/>
-    <w:bookmarkStart w:id="57" w:name="referencias"/>
+    <w:bookmarkEnd w:id="55"/>
+    <w:bookmarkStart w:id="61" w:name="referencias"/>
     <w:p>
       <w:pPr>
         <w:pStyle w:val="Heading1"/>
@@ -6631,7 +7101,7 @@
       <w:r>
         <w:t xml:space="preserve"> </w:t>
       </w:r>
-      <w:hyperlink r:id="rId52">
+      <w:hyperlink r:id="rId56">
         <w:r>
           <w:rPr>
             <w:rStyle w:val="Hyperlink"/>
@@ -6645,7 +7115,7 @@
       <w:r>
         <w:t xml:space="preserve"> </w:t>
       </w:r>
-      <w:hyperlink r:id="rId53">
+      <w:hyperlink r:id="rId57">
         <w:r>
           <w:rPr>
             <w:rStyle w:val="Hyperlink"/>
@@ -6659,7 +7129,7 @@
       <w:r>
         <w:t xml:space="preserve"> </w:t>
       </w:r>
-      <w:hyperlink r:id="rId54">
+      <w:hyperlink r:id="rId58">
         <w:r>
           <w:rPr>
             <w:rStyle w:val="Hyperlink"/>
@@ -6673,7 +7143,7 @@
       <w:r>
         <w:t xml:space="preserve"> </w:t>
       </w:r>
-      <w:hyperlink r:id="rId55">
+      <w:hyperlink r:id="rId59">
         <w:r>
           <w:rPr>
             <w:rStyle w:val="Hyperlink"/>
@@ -6687,7 +7157,7 @@
       <w:r>
         <w:t xml:space="preserve"> </w:t>
       </w:r>
-      <w:hyperlink r:id="rId56">
+      <w:hyperlink r:id="rId60">
         <w:r>
           <w:rPr>
             <w:rStyle w:val="Hyperlink"/>
@@ -6747,7 +7217,7 @@
         <w:t xml:space="preserve">).</w:t>
       </w:r>
     </w:p>
-    <w:bookmarkEnd w:id="57"/>
+    <w:bookmarkEnd w:id="61"/>
     <w:sectPr>
       <w:footnotePr>
         <w:numRestart w:val="eachSect"/>

</xml_diff>

<commit_message>
Diagramas Lambda: sentido de los flujos batch y streaming
- Flecha 1 explícita: los datos van del streaming al batch (cada lectura
  en vivo se copia a bronze)
- Flecha 2: del batch al streaming solo viajan reglas (perfiles y umbrales)
- La reconciliación ("manda el batch") pasa a ser una regla de las vistas
  lumina_olap; el batch no escribe en lumina_rt
- Sustentación (qmd + docx) y arquitectura técnica con la misma aclaración

Co-Authored-By: Claude Opus 5.5 <noreply@anthropic.com>
</commit_message>
<xml_diff>
--- a/docs/entrega1/sustentacion_entrega1.docx
+++ b/docs/entrega1/sustentacion_entrega1.docx
@@ -414,7 +414,7 @@
       <w:r>
         <w:drawing>
           <wp:inline>
-            <wp:extent cx="5334000" cy="2067593"/>
+            <wp:extent cx="5334000" cy="2063486"/>
             <wp:effectExtent b="0" l="0" r="0" t="0"/>
             <wp:docPr descr="Arquitectura de producción en cuatro capas" title="" id="22" name="Picture"/>
             <a:graphic>
@@ -435,7 +435,7 @@
                   <pic:spPr bwMode="auto">
                     <a:xfrm>
                       <a:off x="0" y="0"/>
-                      <a:ext cx="5334000" cy="2067593"/>
+                      <a:ext cx="5334000" cy="2063486"/>
                     </a:xfrm>
                     <a:prstGeom prst="rect">
                       <a:avLst/>
@@ -859,7 +859,7 @@
       <w:r>
         <w:drawing>
           <wp:inline>
-            <wp:extent cx="5334000" cy="765753"/>
+            <wp:extent cx="5334000" cy="609732"/>
             <wp:effectExtent b="0" l="0" r="0" t="0"/>
             <wp:docPr descr="Arquitectura Lambda y puntos de sincronización" title="" id="25" name="Picture"/>
             <a:graphic>
@@ -880,7 +880,7 @@
                   <pic:spPr bwMode="auto">
                     <a:xfrm>
                       <a:off x="0" y="0"/>
-                      <a:ext cx="5334000" cy="765753"/>
+                      <a:ext cx="5334000" cy="609732"/>
                     </a:xfrm>
                     <a:prstGeom prst="rect">
                       <a:avLst/>
@@ -905,6 +905,68 @@
       </w:pPr>
       <w:r>
         <w:t xml:space="preserve">Arquitectura Lambda y puntos de sincronización</w:t>
+      </w:r>
+    </w:p>
+    <w:p>
+      <w:pPr>
+        <w:pStyle w:val="BodyText"/>
+      </w:pPr>
+      <w:r>
+        <w:rPr>
+          <w:b/>
+          <w:bCs/>
+        </w:rPr>
+        <w:t xml:space="preserve">Sentido de los flujos:</w:t>
+      </w:r>
+      <w:r>
+        <w:t xml:space="preserve"> </w:t>
+      </w:r>
+      <w:r>
+        <w:t xml:space="preserve">los</w:t>
+      </w:r>
+      <w:r>
+        <w:t xml:space="preserve"> </w:t>
+      </w:r>
+      <w:r>
+        <w:rPr>
+          <w:b/>
+          <w:bCs/>
+        </w:rPr>
+        <w:t xml:space="preserve">datos</w:t>
+      </w:r>
+      <w:r>
+        <w:t xml:space="preserve"> </w:t>
+      </w:r>
+      <w:r>
+        <w:t xml:space="preserve">van del streaming al batch (cada lectura en vivo se copia a bronze y el batch la vuelve definitiva); del batch al streaming solo viajan</w:t>
+      </w:r>
+      <w:r>
+        <w:t xml:space="preserve"> </w:t>
+      </w:r>
+      <w:r>
+        <w:rPr>
+          <w:b/>
+          <w:bCs/>
+        </w:rPr>
+        <w:t xml:space="preserve">reglas</w:t>
+      </w:r>
+      <w:r>
+        <w:t xml:space="preserve"> </w:t>
+      </w:r>
+      <w:r>
+        <w:t xml:space="preserve">(perfiles y umbrales). El batch no escribe en</w:t>
+      </w:r>
+      <w:r>
+        <w:t xml:space="preserve"> </w:t>
+      </w:r>
+      <w:r>
+        <w:rPr>
+          <w:rStyle w:val="VerbatimChar"/>
+        </w:rPr>
+        <w:t xml:space="preserve">lumina_rt</w:t>
+      </w:r>
+      <w:r>
+        <w:t xml:space="preserve">: la precedencia del batch es una regla de las vistas.</w:t>
       </w:r>
     </w:p>
     <w:tbl>

</xml_diff>

<commit_message>
Diagramas: el job de streaming escribe en bronze y en tablas rt
- La flecha 1 sale de Spark Streaming (no de Kafka): cada lectura se
  guarda en raw/streaming (bronze) y el batch la consolida en curated
- lumina_rt marcado como TABLAS y lumina_olap como CONSULTAS
- Diagrama técnico de tiempo real con la salida a GCS raw/streaming
- Sustentación (qmd + docx) y arquitectura técnica actualizadas

Co-Authored-By: Claude Opus 5.5 <noreply@anthropic.com>
</commit_message>
<xml_diff>
--- a/docs/entrega1/sustentacion_entrega1.docx
+++ b/docs/entrega1/sustentacion_entrega1.docx
@@ -414,7 +414,7 @@
       <w:r>
         <w:drawing>
           <wp:inline>
-            <wp:extent cx="5334000" cy="2063486"/>
+            <wp:extent cx="5334000" cy="2387494"/>
             <wp:effectExtent b="0" l="0" r="0" t="0"/>
             <wp:docPr descr="Arquitectura de producción en cuatro capas" title="" id="22" name="Picture"/>
             <a:graphic>
@@ -435,7 +435,7 @@
                   <pic:spPr bwMode="auto">
                     <a:xfrm>
                       <a:off x="0" y="0"/>
-                      <a:ext cx="5334000" cy="2063486"/>
+                      <a:ext cx="5334000" cy="2387494"/>
                     </a:xfrm>
                     <a:prstGeom prst="rect">
                       <a:avLst/>
@@ -859,7 +859,7 @@
       <w:r>
         <w:drawing>
           <wp:inline>
-            <wp:extent cx="5334000" cy="609732"/>
+            <wp:extent cx="5334000" cy="1078437"/>
             <wp:effectExtent b="0" l="0" r="0" t="0"/>
             <wp:docPr descr="Arquitectura Lambda y puntos de sincronización" title="" id="25" name="Picture"/>
             <a:graphic>
@@ -880,7 +880,7 @@
                   <pic:spPr bwMode="auto">
                     <a:xfrm>
                       <a:off x="0" y="0"/>
-                      <a:ext cx="5334000" cy="609732"/>
+                      <a:ext cx="5334000" cy="1078437"/>
                     </a:xfrm>
                     <a:prstGeom prst="rect">
                       <a:avLst/>
@@ -1049,7 +1049,16 @@
               <w:pStyle w:val="Compact"/>
             </w:pPr>
             <w:r>
-              <w:t xml:space="preserve">Kafka Connect copia cada evento a bronze; el batch nocturno la procesa</w:t>
+              <w:t xml:space="preserve">El job de streaming guarda cada lectura en bronze (además de evaluarla); el batch nocturno la consolida en</w:t>
+            </w:r>
+            <w:r>
+              <w:t xml:space="preserve"> </w:t>
+            </w:r>
+            <w:r>
+              <w:rPr>
+                <w:rStyle w:val="VerbatimChar"/>
+              </w:rPr>
+              <w:t xml:space="preserve">curated</w:t>
             </w:r>
           </w:p>
         </w:tc>

</xml_diff>

<commit_message>
Entrega 1: Firebase solo para avisos push; el login es de Lumina
Firebase Authentication cobraría ~US$91 k/año con 2 M de usuarios activos
(precios de Identity Platform por encima de 50 mil). La API valida el token
del sistema de identidad que ya tiene Lumina (fuera de alcance) y Firebase
queda solo con Cloud Messaging, que es gratuito. Diagrama y docx regenerados.

Co-Authored-By: Claude Opus 5.5 <noreply@anthropic.com>
</commit_message>
<xml_diff>
--- a/docs/entrega1/sustentacion_entrega1.docx
+++ b/docs/entrega1/sustentacion_entrega1.docx
@@ -983,7 +983,7 @@
       <w:r>
         <w:drawing>
           <wp:inline>
-            <wp:extent cx="5334000" cy="2836376"/>
+            <wp:extent cx="5334000" cy="2578279"/>
             <wp:effectExtent b="0" l="0" r="0" t="0"/>
             <wp:docPr descr="Arquitectura de producción en cuatro capas" title="" id="22" name="Picture"/>
             <a:graphic>
@@ -1004,7 +1004,7 @@
                   <pic:spPr bwMode="auto">
                     <a:xfrm>
                       <a:off x="0" y="0"/>
-                      <a:ext cx="5334000" cy="2836376"/>
+                      <a:ext cx="5334000" cy="2578279"/>
                     </a:xfrm>
                     <a:prstGeom prst="rect">
                       <a:avLst/>
@@ -1276,7 +1276,7 @@
               <w:t xml:space="preserve">lumina_olap</w:t>
             </w:r>
             <w:r>
-              <w:t xml:space="preserve">; API REST en Cloud Run; Firebase (Authentication y Cloud Messaging); Looker Studio; tópico</w:t>
+              <w:t xml:space="preserve">; API REST en Cloud Run; Firebase Cloud Messaging; Looker Studio; tópico</w:t>
             </w:r>
             <w:r>
               <w:t xml:space="preserve"> </w:t>
@@ -1296,7 +1296,7 @@
               <w:pStyle w:val="Compact"/>
             </w:pPr>
             <w:r>
-              <w:t xml:space="preserve">Una sola vista de los datos para la app y los informes; inicio de sesión de clientes; avisos al celular; señales de respuesta a la demanda</w:t>
+              <w:t xml:space="preserve">Una sola vista de los datos para la app y los informes; avisos al celular; señales de respuesta a la demanda</w:t>
             </w:r>
           </w:p>
         </w:tc>
@@ -2091,44 +2091,18 @@
                 <w:b/>
                 <w:bCs/>
               </w:rPr>
-              <w:t xml:space="preserve">Firebase</w:t>
-            </w:r>
-          </w:p>
-        </w:tc>
-        <w:tc>
-          <w:tcPr/>
-          <w:p>
-            <w:pPr>
-              <w:pStyle w:val="Compact"/>
-            </w:pPr>
-            <w:r>
-              <w:t xml:space="preserve">Plataforma de Google para apps. Se usan dos piezas:</w:t>
-            </w:r>
-            <w:r>
-              <w:t xml:space="preserve"> </w:t>
-            </w:r>
-            <w:r>
-              <w:rPr>
-                <w:b/>
-                <w:bCs/>
-              </w:rPr>
-              <w:t xml:space="preserve">Authentication</w:t>
-            </w:r>
-            <w:r>
-              <w:t xml:space="preserve">, el inicio de sesión de cada cliente, para que solo vea su hogar; y</w:t>
-            </w:r>
-            <w:r>
-              <w:t xml:space="preserve"> </w:t>
-            </w:r>
-            <w:r>
-              <w:rPr>
-                <w:b/>
-                <w:bCs/>
-              </w:rPr>
-              <w:t xml:space="preserve">Cloud Messaging</w:t>
-            </w:r>
-            <w:r>
-              <w:t xml:space="preserve">, el envío de avisos</w:t>
+              <w:t xml:space="preserve">Firebase Cloud Messaging</w:t>
+            </w:r>
+          </w:p>
+        </w:tc>
+        <w:tc>
+          <w:tcPr/>
+          <w:p>
+            <w:pPr>
+              <w:pStyle w:val="Compact"/>
+            </w:pPr>
+            <w:r>
+              <w:t xml:space="preserve">Servicio gratuito de Google, parte de la plataforma para apps Firebase, que envía avisos</w:t>
             </w:r>
             <w:r>
               <w:t xml:space="preserve"> </w:t>
@@ -5713,7 +5687,7 @@
               <w:pStyle w:val="Compact"/>
             </w:pPr>
             <w:r>
-              <w:t xml:space="preserve">Escala agregando nodos y responde en milisegundos. Firestore cobra por cada escritura: 384 M lecturas al día costarían ≈ US$350–700 diarios</w:t>
+              <w:t xml:space="preserve">Escala agregando nodos y responde en milisegundos, con un costo fijo por nodo. Firestore cobra por cada escritura (US$0.09 por 100 mil en us-central1): guardar 384 M lecturas al día costaría ≈ US$134 k al año en su edición estándar y ≈ US$41 k en la Enterprise, frente a ≈ US$12 k de Bigtable (entre 3 y 11 veces más; a una lectura por minuto, entre 24 y 78 veces)</w:t>
             </w:r>
           </w:p>
         </w:tc>
@@ -5829,7 +5803,7 @@
               <w:pStyle w:val="Compact"/>
             </w:pPr>
             <w:r>
-              <w:t xml:space="preserve">Cloud Run + Firebase + Looker Studio</w:t>
+              <w:t xml:space="preserve">Cloud Run + Firebase Cloud Messaging + Looker Studio</w:t>
             </w:r>
           </w:p>
         </w:tc>
@@ -5851,7 +5825,66 @@
               <w:pStyle w:val="Compact"/>
             </w:pPr>
             <w:r>
-              <w:t xml:space="preserve">Cloud Run escala a cero y crece con la demanda. Firebase da el inicio de sesión y los avisos push sin construirlos. Looker Studio es gratuito</w:t>
+              <w:t xml:space="preserve">Cloud Run escala a cero y crece con la demanda. Firebase Cloud Messaging envía los avisos push sin costo. Looker Studio es gratuito</w:t>
+            </w:r>
+          </w:p>
+        </w:tc>
+      </w:tr>
+      <w:tr>
+        <w:tc>
+          <w:tcPr/>
+          <w:p>
+            <w:pPr>
+              <w:pStyle w:val="Compact"/>
+            </w:pPr>
+            <w:r>
+              <w:t xml:space="preserve">Inicio de sesión de clientes</w:t>
+            </w:r>
+          </w:p>
+        </w:tc>
+        <w:tc>
+          <w:tcPr/>
+          <w:p>
+            <w:pPr>
+              <w:pStyle w:val="Compact"/>
+            </w:pPr>
+            <w:r>
+              <w:t xml:space="preserve">El sistema de identidad que ya tiene Lumina; la API valida su</w:t>
+            </w:r>
+            <w:r>
+              <w:t xml:space="preserve"> </w:t>
+            </w:r>
+            <w:r>
+              <w:rPr>
+                <w:i/>
+                <w:iCs/>
+              </w:rPr>
+              <w:t xml:space="preserve">token</w:t>
+            </w:r>
+            <w:r>
+              <w:t xml:space="preserve">, la credencial digital que prueba quién inició sesión</w:t>
+            </w:r>
+          </w:p>
+        </w:tc>
+        <w:tc>
+          <w:tcPr/>
+          <w:p>
+            <w:pPr>
+              <w:pStyle w:val="Compact"/>
+            </w:pPr>
+            <w:r>
+              <w:t xml:space="preserve">Firebase Authentication</w:t>
+            </w:r>
+          </w:p>
+        </w:tc>
+        <w:tc>
+          <w:tcPr/>
+          <w:p>
+            <w:pPr>
+              <w:pStyle w:val="Compact"/>
+            </w:pPr>
+            <w:r>
+              <w:t xml:space="preserve">Firebase Authentication cobra por usuario activo al mes por encima de 50 mil: con 2 M de clientes costaría ≈ US$91 k al año, tres veces el costo de toda la plataforma</w:t>
             </w:r>
           </w:p>
         </w:tc>
@@ -10500,7 +10533,7 @@
         </w:numPr>
       </w:pPr>
       <w:r>
-        <w:t xml:space="preserve">con Firebase Authentication, cada cliente solo puede consultar su propio hogar en la API.</w:t>
+        <w:t xml:space="preserve">la API valida el token del inicio de sesión que ya tiene Lumina, así que cada cliente solo puede consultar su propio hogar.</w:t>
       </w:r>
     </w:p>
     <w:p>
@@ -10736,7 +10769,19 @@
         </w:numPr>
       </w:pPr>
       <w:r>
-        <w:t xml:space="preserve">Firebase Cloud Messaging es gratuito. Firebase Authentication puede cobrar por usuario activo según el plan, y no está en la calculadora.</w:t>
+        <w:t xml:space="preserve">Firebase Cloud Messaging es gratuito, así que no aparece en la calculadora;</w:t>
+      </w:r>
+    </w:p>
+    <w:p>
+      <w:pPr>
+        <w:pStyle w:val="Compact"/>
+        <w:numPr>
+          <w:ilvl w:val="0"/>
+          <w:numId w:val="1028"/>
+        </w:numPr>
+      </w:pPr>
+      <w:r>
+        <w:t xml:space="preserve">los clientes ya inician sesión con un sistema de Lumina, y la API solo valida ese token.</w:t>
       </w:r>
     </w:p>
     <w:p>
@@ -10809,7 +10854,19 @@
         <w:t xml:space="preserve">front-end</w:t>
       </w:r>
       <w:r>
-        <w:t xml:space="preserve">, es decir, las pantallas de la app y la web, adjudicado en otra RFP.</w:t>
+        <w:t xml:space="preserve">, es decir, las pantallas de la app y la web, adjudicado en otra RFP;</w:t>
+      </w:r>
+    </w:p>
+    <w:p>
+      <w:pPr>
+        <w:pStyle w:val="Compact"/>
+        <w:numPr>
+          <w:ilvl w:val="0"/>
+          <w:numId w:val="1029"/>
+        </w:numPr>
+      </w:pPr>
+      <w:r>
+        <w:t xml:space="preserve">el inicio de sesión de los clientes, que ya resuelve un sistema de Lumina.</w:t>
       </w:r>
     </w:p>
     <w:bookmarkEnd w:id="54"/>
@@ -11726,18 +11783,18 @@
               <w:pStyle w:val="Compact"/>
             </w:pPr>
             <w:r>
-              <w:t xml:space="preserve">Firebase</w:t>
-            </w:r>
-          </w:p>
-        </w:tc>
-        <w:tc>
-          <w:tcPr/>
-          <w:p>
-            <w:pPr>
-              <w:pStyle w:val="Compact"/>
-            </w:pPr>
-            <w:r>
-              <w:t xml:space="preserve">Plataforma de Google para apps; aquí, inicio de sesión (Authentication) y avisos push (Cloud Messaging)</w:t>
+              <w:t xml:space="preserve">Firebase Cloud Messaging</w:t>
+            </w:r>
+          </w:p>
+        </w:tc>
+        <w:tc>
+          <w:tcPr/>
+          <w:p>
+            <w:pPr>
+              <w:pStyle w:val="Compact"/>
+            </w:pPr>
+            <w:r>
+              <w:t xml:space="preserve">Servicio gratuito de Google (parte de Firebase) que envía avisos push al celular</w:t>
             </w:r>
           </w:p>
         </w:tc>
@@ -12494,6 +12551,34 @@
             </w:pPr>
             <w:r>
               <w:t xml:space="preserve">Procesamiento en flujo: cada dato apenas llega, en segundos</w:t>
+            </w:r>
+          </w:p>
+        </w:tc>
+      </w:tr>
+      <w:tr>
+        <w:tc>
+          <w:tcPr/>
+          <w:p>
+            <w:pPr>
+              <w:pStyle w:val="Compact"/>
+            </w:pPr>
+            <w:r>
+              <w:rPr>
+                <w:i/>
+                <w:iCs/>
+              </w:rPr>
+              <w:t xml:space="preserve">Token</w:t>
+            </w:r>
+          </w:p>
+        </w:tc>
+        <w:tc>
+          <w:tcPr/>
+          <w:p>
+            <w:pPr>
+              <w:pStyle w:val="Compact"/>
+            </w:pPr>
+            <w:r>
+              <w:t xml:space="preserve">Credencial digital que prueba quién inició sesión; la API la valida en cada petición</w:t>
             </w:r>
           </w:p>
         </w:tc>

</xml_diff>